<commit_message>
Update Item 01 SGB Constitution evidence pack to reflect pre-August SGB membership (Bambilawu present, Engelbrecht & Von Solms joining in August)
</commit_message>
<xml_diff>
--- a/SGB_Functionality_Audit_2026/01_SGB_Constitution/03_Signed_Attendance_Register_2026-01-28.docx
+++ b/SGB_Functionality_Audit_2026/01_SGB_Constitution/03_Signed_Attendance_Register_2026-01-28.docx
@@ -718,7 +718,7 @@
                 <w:sz w:val="20"/>
                 <w:szCs w:val="20"/>
               </w:rPr>
-              <w:t xml:space="preserve">Mr. Anthony Engelbrecht</w:t>
+              <w:t xml:space="preserve">Mr. Bennie Bekker</w:t>
             </w:r>
           </w:p>
         </w:tc>
@@ -747,7 +747,7 @@
                 <w:sz w:val="20"/>
                 <w:szCs w:val="20"/>
               </w:rPr>
-              <w:t xml:space="preserve">Educator Component • Present</w:t>
+              <w:t xml:space="preserve">Non-Teaching Staff Component • Present</w:t>
             </w:r>
           </w:p>
         </w:tc>
@@ -779,7 +779,7 @@
                 <w:sz w:val="20"/>
                 <w:szCs w:val="20"/>
               </w:rPr>
-              <w:t xml:space="preserve">Miss Nellie Von Solms</w:t>
+              <w:t xml:space="preserve">Bathabile Lichaba (RCL Chair)</w:t>
             </w:r>
           </w:p>
         </w:tc>
@@ -807,7 +807,7 @@
                 <w:sz w:val="20"/>
                 <w:szCs w:val="20"/>
               </w:rPr>
-              <w:t xml:space="preserve">Educator Component • Present</w:t>
+              <w:t xml:space="preserve">Learner Component • Present</w:t>
             </w:r>
           </w:p>
         </w:tc>
@@ -840,7 +840,7 @@
                 <w:sz w:val="20"/>
                 <w:szCs w:val="20"/>
               </w:rPr>
-              <w:t xml:space="preserve">Mr. Bennie Bekker</w:t>
+              <w:t xml:space="preserve">Niluve Matu (Head Girl)</w:t>
             </w:r>
           </w:p>
         </w:tc>
@@ -869,7 +869,7 @@
                 <w:sz w:val="20"/>
                 <w:szCs w:val="20"/>
               </w:rPr>
-              <w:t xml:space="preserve">Non-Teaching Staff Component • Present</w:t>
+              <w:t xml:space="preserve">Learner Component • Present</w:t>
             </w:r>
           </w:p>
         </w:tc>
@@ -901,7 +901,7 @@
                 <w:sz w:val="20"/>
                 <w:szCs w:val="20"/>
               </w:rPr>
-              <w:t xml:space="preserve">Bathabile Lichaba (RCL Chair)</w:t>
+              <w:t xml:space="preserve">Alumanye Nxele (Head Boy)</w:t>
             </w:r>
           </w:p>
         </w:tc>
@@ -929,128 +929,6 @@
                 <w:sz w:val="20"/>
                 <w:szCs w:val="20"/>
               </w:rPr>
-              <w:t xml:space="preserve">Learner Component • Present</w:t>
-            </w:r>
-          </w:p>
-        </w:tc>
-      </w:tr>
-      <w:tr>
-        <w:tc>
-          <w:tcPr>
-            <w:tcW w:type="dxa" w:w="4081"/>
-            <w:tcBorders>
-              <w:top w:val="single" w:color="CBD5E1" w:sz="4"/>
-              <w:left w:val="single" w:color="CBD5E1" w:sz="4"/>
-              <w:bottom w:val="single" w:color="CBD5E1" w:sz="4"/>
-              <w:right w:val="single" w:color="CBD5E1" w:sz="4"/>
-            </w:tcBorders>
-            <w:shd w:fill="F8FAFC"/>
-            <w:tcMar>
-              <w:top w:type="dxa" w:w="80"/>
-              <w:left w:type="dxa" w:w="140"/>
-              <w:bottom w:type="dxa" w:w="80"/>
-              <w:right w:type="dxa" w:w="140"/>
-            </w:tcMar>
-          </w:tcPr>
-          <w:p>
-            <w:r>
-              <w:rPr>
-                <w:rFonts w:ascii="Arial" w:cs="Arial" w:eastAsia="Arial" w:hAnsi="Arial"/>
-                <w:b/>
-                <w:bCs/>
-                <w:color w:val="0C2340"/>
-                <w:sz w:val="20"/>
-                <w:szCs w:val="20"/>
-              </w:rPr>
-              <w:t xml:space="preserve">Niluve Matu (Head Girl)</w:t>
-            </w:r>
-          </w:p>
-        </w:tc>
-        <w:tc>
-          <w:tcPr>
-            <w:tcW w:type="dxa" w:w="6689"/>
-            <w:tcBorders>
-              <w:top w:val="single" w:color="CBD5E1" w:sz="4"/>
-              <w:left w:val="single" w:color="CBD5E1" w:sz="4"/>
-              <w:bottom w:val="single" w:color="CBD5E1" w:sz="4"/>
-              <w:right w:val="single" w:color="CBD5E1" w:sz="4"/>
-            </w:tcBorders>
-            <w:shd w:fill="F8FAFC"/>
-            <w:tcMar>
-              <w:top w:type="dxa" w:w="80"/>
-              <w:left w:type="dxa" w:w="140"/>
-              <w:bottom w:type="dxa" w:w="80"/>
-              <w:right w:type="dxa" w:w="140"/>
-            </w:tcMar>
-          </w:tcPr>
-          <w:p>
-            <w:r>
-              <w:rPr>
-                <w:rFonts w:ascii="Arial" w:cs="Arial" w:eastAsia="Arial" w:hAnsi="Arial"/>
-                <w:color w:val="1A1A1A"/>
-                <w:sz w:val="20"/>
-                <w:szCs w:val="20"/>
-              </w:rPr>
-              <w:t xml:space="preserve">Learner Component • Present</w:t>
-            </w:r>
-          </w:p>
-        </w:tc>
-      </w:tr>
-      <w:tr>
-        <w:tc>
-          <w:tcPr>
-            <w:tcW w:type="dxa" w:w="4081"/>
-            <w:tcBorders>
-              <w:top w:val="single" w:color="CBD5E1" w:sz="4"/>
-              <w:left w:val="single" w:color="CBD5E1" w:sz="4"/>
-              <w:bottom w:val="single" w:color="CBD5E1" w:sz="4"/>
-              <w:right w:val="single" w:color="CBD5E1" w:sz="4"/>
-            </w:tcBorders>
-            <w:tcMar>
-              <w:top w:type="dxa" w:w="80"/>
-              <w:left w:type="dxa" w:w="140"/>
-              <w:bottom w:type="dxa" w:w="80"/>
-              <w:right w:type="dxa" w:w="140"/>
-            </w:tcMar>
-          </w:tcPr>
-          <w:p>
-            <w:r>
-              <w:rPr>
-                <w:rFonts w:ascii="Arial" w:cs="Arial" w:eastAsia="Arial" w:hAnsi="Arial"/>
-                <w:b/>
-                <w:bCs/>
-                <w:color w:val="0C2340"/>
-                <w:sz w:val="20"/>
-                <w:szCs w:val="20"/>
-              </w:rPr>
-              <w:t xml:space="preserve">Alumanye Nxele (Head Boy)</w:t>
-            </w:r>
-          </w:p>
-        </w:tc>
-        <w:tc>
-          <w:tcPr>
-            <w:tcW w:type="dxa" w:w="6689"/>
-            <w:tcBorders>
-              <w:top w:val="single" w:color="CBD5E1" w:sz="4"/>
-              <w:left w:val="single" w:color="CBD5E1" w:sz="4"/>
-              <w:bottom w:val="single" w:color="CBD5E1" w:sz="4"/>
-              <w:right w:val="single" w:color="CBD5E1" w:sz="4"/>
-            </w:tcBorders>
-            <w:tcMar>
-              <w:top w:type="dxa" w:w="80"/>
-              <w:left w:type="dxa" w:w="140"/>
-              <w:bottom w:type="dxa" w:w="80"/>
-              <w:right w:type="dxa" w:w="140"/>
-            </w:tcMar>
-          </w:tcPr>
-          <w:p>
-            <w:r>
-              <w:rPr>
-                <w:rFonts w:ascii="Arial" w:cs="Arial" w:eastAsia="Arial" w:hAnsi="Arial"/>
-                <w:color w:val="1A1A1A"/>
-                <w:sz w:val="20"/>
-                <w:szCs w:val="20"/>
-              </w:rPr>
               <w:t xml:space="preserve">Learner Component • Apology</w:t>
             </w:r>
           </w:p>
@@ -1258,7 +1136,7 @@
           <w:sz w:val="20"/>
           <w:szCs w:val="20"/>
         </w:rPr>
-        <w:t xml:space="preserve">Total SGB Members: 11 Members | Members Present: 10 Members | Apologies: 1 Member.</w:t>
+        <w:t xml:space="preserve">Total SGB Members: 9 Members | Members Present: 8 Members | Apologies: 1 Member.</w:t>
       </w:r>
     </w:p>
     <w:p>
@@ -1537,7 +1415,7 @@
           <w:sz w:val="20"/>
           <w:szCs w:val="20"/>
         </w:rPr>
-        <w:t xml:space="preserve">Educator Component:</w:t>
+        <w:t xml:space="preserve">Non-Teaching Staff Component:</w:t>
       </w:r>
     </w:p>
     <w:p>
@@ -1553,23 +1431,7 @@
           <w:sz w:val="20"/>
           <w:szCs w:val="20"/>
         </w:rPr>
-        <w:t xml:space="preserve">- Mr. Anthony Engelbrecht (SGB Educator Rep) — Present (Signed)</w:t>
-      </w:r>
-    </w:p>
-    <w:p>
-      <w:pPr>
-        <w:spacing w:after="90" w:before="70" w:line="276"/>
-        <w:ind w:left="0"/>
-        <w:jc w:val="both"/>
-      </w:pPr>
-      <w:r>
-        <w:rPr>
-          <w:rFonts w:ascii="Arial" w:cs="Arial" w:eastAsia="Arial" w:hAnsi="Arial"/>
-          <w:color w:val="1A1A1A"/>
-          <w:sz w:val="20"/>
-          <w:szCs w:val="20"/>
-        </w:rPr>
-        <w:t xml:space="preserve">- Miss Nellie Von Solms (SGB Educator Rep) — Present (Signed)</w:t>
+        <w:t xml:space="preserve">- Mr. Bennie Bekker (SGB Non-Teaching Rep) — Present (Signed)</w:t>
       </w:r>
     </w:p>
     <w:p>
@@ -1591,62 +1453,6 @@
           <w:szCs w:val="20"/>
         </w:rPr>
         <w:t xml:space="preserve">2.4</w:t>
-      </w:r>
-      <w:r>
-        <w:rPr>
-          <w:rFonts w:ascii="Arial" w:cs="Arial" w:eastAsia="Arial" w:hAnsi="Arial"/>
-          <w:sz w:val="20"/>
-          <w:szCs w:val="20"/>
-        </w:rPr>
-        <w:t xml:space="preserve">	</w:t>
-      </w:r>
-      <w:r>
-        <w:rPr>
-          <w:rFonts w:ascii="Arial" w:cs="Arial" w:eastAsia="Arial" w:hAnsi="Arial"/>
-          <w:b w:val="false"/>
-          <w:bCs w:val="false"/>
-          <w:color w:val="1A1A1A"/>
-          <w:sz w:val="20"/>
-          <w:szCs w:val="20"/>
-        </w:rPr>
-        <w:t xml:space="preserve">Non-Teaching Staff Component:</w:t>
-      </w:r>
-    </w:p>
-    <w:p>
-      <w:pPr>
-        <w:spacing w:after="90" w:before="70" w:line="276"/>
-        <w:ind w:left="0"/>
-        <w:jc w:val="both"/>
-      </w:pPr>
-      <w:r>
-        <w:rPr>
-          <w:rFonts w:ascii="Arial" w:cs="Arial" w:eastAsia="Arial" w:hAnsi="Arial"/>
-          <w:color w:val="1A1A1A"/>
-          <w:sz w:val="20"/>
-          <w:szCs w:val="20"/>
-        </w:rPr>
-        <w:t xml:space="preserve">- Mr. Bennie Bekker (SGB Non-Teaching Rep) — Present (Signed)</w:t>
-      </w:r>
-    </w:p>
-    <w:p>
-      <w:pPr>
-        <w:tabs>
-          <w:tab w:val="left" w:pos="566"/>
-        </w:tabs>
-        <w:spacing w:after="90" w:before="70" w:line="276"/>
-        <w:ind w:left="566" w:hanging="566"/>
-        <w:jc w:val="both"/>
-      </w:pPr>
-      <w:r>
-        <w:rPr>
-          <w:rFonts w:ascii="Arial" w:cs="Arial" w:eastAsia="Arial" w:hAnsi="Arial"/>
-          <w:b/>
-          <w:bCs/>
-          <w:color w:val="1A1A1A"/>
-          <w:sz w:val="20"/>
-          <w:szCs w:val="20"/>
-        </w:rPr>
-        <w:t xml:space="preserve">2.5</w:t>
       </w:r>
       <w:r>
         <w:rPr>

</xml_diff>